<commit_message>
Fix technical check: add Fig. 2/5 in-text citations and missing ref citations [7,8,11,12,13,14]
Co-Authored-By: Tatsuki Onishi <bougtoir@gmail.com>
</commit_message>
<xml_diff>
--- a/reproducibility-crisis-commercial-software/output/paper_scientific_data_english.docx
+++ b/reproducibility-crisis-commercial-software/output/paper_scientific_data_english.docx
@@ -114,7 +114,7 @@
           <w:i w:val="0"/>
           <w:sz w:val="22"/>
         </w:rPr>
-        <w:t>More than a decade after the term "reproducibility crisis" entered mainstream scientific discourse, significant progress has been made in establishing norms for data sharing and code availability. Baker's landmark 2016 survey in Nature revealed that over 70% of researchers had tried and failed to reproduce another scientist's experiments, catalyzing institutional responses from funding agencies, publishers, and professional societies. Subsequent efforts have focused on open data mandates, code sharing policies, and the development of reproducibility-enhancing tools such as containerization platforms (Docker, Singularity) and workflow management systems (Nextflow, Snakemake).</w:t>
+        <w:t>More than a decade after the term "reproducibility crisis" entered mainstream scientific discourse, significant progress has been made in establishing norms for data sharing and code availability. Baker's landmark 2016 survey in Nature revealed that over 70% of researchers had tried and failed to reproduce another scientist's experiments [1], catalyzing institutional responses from funding agencies, publishers, and professional societies. The FAIR Guiding Principles [7] have provided a foundational framework for scientific data management, while early work by Gentleman and Temple Lang [8] established the concept of computable documents integrating code and narrative. Subsequent efforts have focused on open data mandates, code sharing policies [13], and the development of reproducibility-enhancing tools such as containerization platforms (Docker, Singularity) and workflow management systems (Nextflow, Snakemake).</w:t>
       </w:r>
     </w:p>
     <w:p>
@@ -125,7 +125,7 @@
           <w:i w:val="0"/>
           <w:sz w:val="22"/>
         </w:rPr>
-        <w:t>However, these efforts have largely overlooked a fundamental barrier: the dependency of published research on commercial software. When a researcher reports using "SPSS version 26" or "MATLAB R2021a" in their methods section, an implicit assumption is made that future researchers can access these exact tools to verify the findings. In practice, this assumption frequently fails. Commercial software vendors typically do not provide access to legacy versions, subscription models prevent access after license expiration, and the substantial cost of proprietary licenses creates financial barriers to replication, particularly for researchers in low- and middle-income countries.</w:t>
+        <w:t>However, these efforts have largely overlooked a fundamental barrier: the dependency of published research on commercial software. Miyakawa [11] has highlighted the broader crisis of missing raw data in published research, while Konkol et al. [12] documented the challenges of computational reproducibility in geoscientific papers. When a researcher reports using "SPSS version 26" or "MATLAB R2021a" in their methods section, an implicit assumption is made that future researchers can access these exact tools to verify the findings. In practice, this assumption frequently fails. Commercial software vendors typically do not provide access to legacy versions, subscription models prevent access after license expiration, and the substantial cost of proprietary licenses creates financial barriers to replication, particularly for researchers in low- and middle-income countries.</w:t>
       </w:r>
     </w:p>
     <w:p>
@@ -1308,7 +1308,7 @@
           <w:i w:val="0"/>
           <w:sz w:val="22"/>
         </w:rPr>
-        <w:t>The five most frequently cited commercial software tools were SPSS (n=807, 8.1%), GraphPad Prism (n=410, 4.1%), MATLAB (n=170, 1.7%), Microsoft Excel (n=152, 1.5%), and Stata (n=101, 1.0%). Among open-source tools, R dominated (n=890), followed by Cytoscape (n=140), ImageJ (n=232), ggplot2 (n=165), and Python (n=167).</w:t>
+        <w:t>The five most frequently cited commercial software tools were SPSS (n=807, 8.1%), GraphPad Prism (n=410, 4.1%), MATLAB (n=170, 1.7%), Microsoft Excel (n=152, 1.5%), and Stata (n=101, 1.0%) (Fig. 2). Among open-source tools, R dominated (n=890), followed by Cytoscape (n=140), ImageJ (n=232), ggplot2 (n=165), and Python (n=167).</w:t>
       </w:r>
     </w:p>
     <w:p>
@@ -1513,7 +1513,7 @@
           <w:i w:val="0"/>
           <w:sz w:val="22"/>
         </w:rPr>
-        <w:t>For commercial software citations that included version numbers, we assessed whether those specific versions are currently obtainable. The majority of cited versions were classified as "likely unavailable" — meaning the vendor does not offer legacy version access, and only the current version is available for purchase or subscription. This finding quantifies the "version accessibility gap": even when researchers diligently report which software version they used, replication may be impossible because that version cannot be obtained.</w:t>
+        <w:t>For commercial software citations that included version numbers, we assessed whether those specific versions are currently obtainable (Fig. 5). The majority of cited versions were classified as "likely unavailable" — meaning the vendor does not offer legacy version access, and only the current version is available for purchase or subscription. This finding quantifies the "version accessibility gap": even when researchers diligently report which software version they used, replication may be impossible because that version cannot be obtained.</w:t>
       </w:r>
     </w:p>
     <w:p>
@@ -2655,7 +2655,7 @@
           <w:i w:val="0"/>
           <w:sz w:val="22"/>
         </w:rPr>
-        <w:t>Our findings extend the foundational work of Collberg et al. (2015), who reported that only 32.3% of computational papers could be successfully reproduced, by quantifying the specific contribution of commercial software dependency to this reproducibility failure. While previous studies have focused on code availability, data sharing, and computational environment reproducibility, our work specifically addresses the software licensing and version accessibility dimensions.</w:t>
+        <w:t>Our findings extend the foundational work of Collberg et al. [3], who reported that only 32.3% of computational papers could be successfully reproduced, by quantifying the specific contribution of commercial software dependency to this reproducibility failure. Krafczyk et al. [14] further demonstrated the risks of misinterpretation when attempting to reproduce computational results, reinforcing the importance of exact software version availability. While previous studies have focused on code availability, data sharing, and computational environment reproducibility, our work specifically addresses the software licensing and version accessibility dimensions.</w:t>
       </w:r>
     </w:p>
     <w:p>

</xml_diff>